<commit_message>
Add accumulation math, concrete instruments, and MEI cap detail to plan
- Adds estimated timeframes to each Phase 3 net-worth milestone
- Adds an "Accumulation Math (Illustrative)" table showing the
  savings-rate/return assumptions behind the R$500k and R$1M estimates
- Names concrete low-cost instruments (Tesouro Selic, CDI-linked CDB,
  BOVA11, IVVB11) instead of generic "diversified portfolio" language
- Flags the MEI revenue ceiling (R$81,000/year) against the plan's own
  1-year income target, which exceeds it
</commit_message>
<xml_diff>
--- a/docs/Personal_Financial_Strategic_Plan.docx
+++ b/docs/Personal_Financial_Strategic_Plan.docx
@@ -1474,7 +1474,7 @@
         <w:spacing w:after="120" w:before="240"/>
       </w:pPr>
       <w:r>
-        <w:t xml:space="preserve">R$10,000</w:t>
+        <w:t xml:space="preserve">R$10,000 — Est. ~6–9 months</w:t>
       </w:r>
     </w:p>
     <w:p>
@@ -1548,20 +1548,20 @@
         <w:spacing w:after="120" w:before="240"/>
       </w:pPr>
       <w:r>
-        <w:t xml:space="preserve">R$50,000</w:t>
-      </w:r>
-    </w:p>
-    <w:p>
-      <w:pPr>
-        <w:pStyle w:val="ListParagraph"/>
-        <w:numPr>
-          <w:ilvl w:val="0"/>
-          <w:numId w:val="2"/>
-        </w:numPr>
-        <w:spacing w:after="80"/>
-      </w:pPr>
-      <w:r>
-        <w:t xml:space="preserve">What to do: Formalize as a small business/MEI if in Brazil (tax efficiency). Diversify to 4–6 income sources (mix of retainers and one-off higher-ticket projects). Start a liquid, low-cost investment (e.g., Tesouro Selic or equivalent) for the buffer beyond 3 months.</w:t>
+        <w:t xml:space="preserve">R$50,000 — Est. ~Year 2 (18–24 months)</w:t>
+      </w:r>
+    </w:p>
+    <w:p>
+      <w:pPr>
+        <w:pStyle w:val="ListParagraph"/>
+        <w:numPr>
+          <w:ilvl w:val="0"/>
+          <w:numId w:val="2"/>
+        </w:numPr>
+        <w:spacing w:after="80"/>
+      </w:pPr>
+      <w:r>
+        <w:t xml:space="preserve">What to do: Formalize as a small business/MEI if in Brazil (tax efficiency). Note: MEI has a hard revenue ceiling of R$81,000/year (≈R$6,750/month, 2026 rules) — this plan's own 1-year revenue goal (R$8,000–10,000/month) exceeds that, so budget for graduating to Simples Nacional (ME) around this stage rather than staying MEI indefinitely. Diversify to 4–6 income sources (mix of retainers and one-off higher-ticket projects). Start a liquid, low-cost investment (e.g., Tesouro Selic or a CDI-linked CDB with daily liquidity) for the buffer beyond 3 months.</w:t>
       </w:r>
     </w:p>
     <w:p>
@@ -1622,7 +1622,7 @@
         <w:spacing w:after="120" w:before="240"/>
       </w:pPr>
       <w:r>
-        <w:t xml:space="preserve">R$100,000</w:t>
+        <w:t xml:space="preserve">R$100,000 — Est. ~Year 3</w:t>
       </w:r>
     </w:p>
     <w:p>
@@ -1674,7 +1674,7 @@
         <w:spacing w:after="80"/>
       </w:pPr>
       <w:r>
-        <w:t xml:space="preserve">Where to invest money: Index funds / ETFs (broad, low-cost). Small allocation (5–10%) to higher-risk bets if desired, never more.</w:t>
+        <w:t xml:space="preserve">Where to invest money: Index funds / ETFs (broad, low-cost — e.g., BOVA11 for Brazilian equity exposure, IVVB11 for BRL-hedged S&amp;P 500 exposure, or a low-fee multimarket index fund via a discount brokerage). Small allocation (5–10%) to higher-risk bets if desired, never more.</w:t>
       </w:r>
     </w:p>
     <w:p>
@@ -1696,7 +1696,7 @@
         <w:spacing w:after="120" w:before="240"/>
       </w:pPr>
       <w:r>
-        <w:t xml:space="preserve">R$500,000</w:t>
+        <w:t xml:space="preserve">R$500,000 — Est. ~Year 7</w:t>
       </w:r>
     </w:p>
     <w:p>
@@ -1770,7 +1770,7 @@
         <w:spacing w:after="120" w:before="240"/>
       </w:pPr>
       <w:r>
-        <w:t xml:space="preserve">R$1,000,000</w:t>
+        <w:t xml:space="preserve">R$1,000,000 — Est. ~Year 10</w:t>
       </w:r>
     </w:p>
     <w:p>
@@ -1836,6 +1836,328 @@
       </w:pPr>
       <w:r>
         <w:t xml:space="preserve">Skills to develop: Long-term tax and estate planning.</w:t>
+      </w:r>
+    </w:p>
+    <w:p>
+      <w:pPr>
+        <w:pStyle w:val="Heading2"/>
+        <w:spacing w:after="120" w:before="240"/>
+      </w:pPr>
+      <w:r>
+        <w:t xml:space="preserve">Accumulation Math (Illustrative)</w:t>
+      </w:r>
+    </w:p>
+    <w:p>
+      <w:pPr>
+        <w:spacing w:after="140"/>
+      </w:pPr>
+      <w:r>
+        <w:t xml:space="preserve">The milestones above are directional, not derived. Using illustrative planning inputs — ≈R$7,000/month invested from the R$100k stage onward and a ≈9%/year nominal blended return (liquid Selic-linked instruments early, broader index exposure later) — here is roughly when each milestone is reached if the income targets in Phase 5 are hit on schedule:</w:t>
+      </w:r>
+    </w:p>
+    <w:tbl>
+      <w:tblPr>
+        <w:tblW w:type="dxa" w:w="9500"/>
+        <w:tblBorders>
+          <w:top w:val="single" w:color="auto" w:sz="4"/>
+          <w:left w:val="single" w:color="auto" w:sz="4"/>
+          <w:bottom w:val="single" w:color="auto" w:sz="4"/>
+          <w:right w:val="single" w:color="auto" w:sz="4"/>
+          <w:insideH w:val="single" w:color="auto" w:sz="4"/>
+          <w:insideV w:val="single" w:color="auto" w:sz="4"/>
+        </w:tblBorders>
+      </w:tblPr>
+      <w:tblGrid>
+        <w:gridCol w:w="3167"/>
+        <w:gridCol w:w="3167"/>
+        <w:gridCol w:w="3166"/>
+      </w:tblGrid>
+      <w:tr>
+        <w:trPr>
+          <w:tblHeader/>
+        </w:trPr>
+        <w:tc>
+          <w:tcPr>
+            <w:tcW w:type="dxa" w:w="3167"/>
+            <w:shd w:fill="1F2937" w:val="clear"/>
+          </w:tcPr>
+          <w:p>
+            <w:r>
+              <w:rPr>
+                <w:b/>
+                <w:bCs/>
+                <w:color w:val="FFFFFF"/>
+                <w:sz w:val="20"/>
+                <w:szCs w:val="20"/>
+              </w:rPr>
+              <w:t xml:space="preserve">Milestone</w:t>
+            </w:r>
+          </w:p>
+        </w:tc>
+        <w:tc>
+          <w:tcPr>
+            <w:tcW w:type="dxa" w:w="3167"/>
+            <w:shd w:fill="1F2937" w:val="clear"/>
+          </w:tcPr>
+          <w:p>
+            <w:r>
+              <w:rPr>
+                <w:b/>
+                <w:bCs/>
+                <w:color w:val="FFFFFF"/>
+                <w:sz w:val="20"/>
+                <w:szCs w:val="20"/>
+              </w:rPr>
+              <w:t xml:space="preserve">Est. timeframe</w:t>
+            </w:r>
+          </w:p>
+        </w:tc>
+        <w:tc>
+          <w:tcPr>
+            <w:tcW w:type="dxa" w:w="3166"/>
+            <w:shd w:fill="1F2937" w:val="clear"/>
+          </w:tcPr>
+          <w:p>
+            <w:r>
+              <w:rPr>
+                <w:b/>
+                <w:bCs/>
+                <w:color w:val="FFFFFF"/>
+                <w:sz w:val="20"/>
+                <w:szCs w:val="20"/>
+              </w:rPr>
+              <w:t xml:space="preserve">Model assumption</w:t>
+            </w:r>
+          </w:p>
+        </w:tc>
+      </w:tr>
+      <w:tr>
+        <w:tc>
+          <w:tcPr>
+            <w:tcW w:type="dxa" w:w="3167"/>
+          </w:tcPr>
+          <w:p>
+            <w:r>
+              <w:rPr>
+                <w:sz w:val="20"/>
+                <w:szCs w:val="20"/>
+              </w:rPr>
+              <w:t xml:space="preserve">R$10,000</w:t>
+            </w:r>
+          </w:p>
+        </w:tc>
+        <w:tc>
+          <w:tcPr>
+            <w:tcW w:type="dxa" w:w="3167"/>
+          </w:tcPr>
+          <w:p>
+            <w:r>
+              <w:rPr>
+                <w:sz w:val="20"/>
+                <w:szCs w:val="20"/>
+              </w:rPr>
+              <w:t xml:space="preserve">~6–9 months</w:t>
+            </w:r>
+          </w:p>
+        </w:tc>
+        <w:tc>
+          <w:tcPr>
+            <w:tcW w:type="dxa" w:w="3166"/>
+          </w:tcPr>
+          <w:p>
+            <w:r>
+              <w:rPr>
+                <w:sz w:val="20"/>
+                <w:szCs w:val="20"/>
+              </w:rPr>
+              <w:t xml:space="preserve">3-month emergency fund + ≈R$1,200–1,500/month saved from early retainers.</w:t>
+            </w:r>
+          </w:p>
+        </w:tc>
+      </w:tr>
+      <w:tr>
+        <w:tc>
+          <w:tcPr>
+            <w:tcW w:type="dxa" w:w="3167"/>
+          </w:tcPr>
+          <w:p>
+            <w:r>
+              <w:rPr>
+                <w:sz w:val="20"/>
+                <w:szCs w:val="20"/>
+              </w:rPr>
+              <w:t xml:space="preserve">R$50,000</w:t>
+            </w:r>
+          </w:p>
+        </w:tc>
+        <w:tc>
+          <w:tcPr>
+            <w:tcW w:type="dxa" w:w="3167"/>
+          </w:tcPr>
+          <w:p>
+            <w:r>
+              <w:rPr>
+                <w:sz w:val="20"/>
+                <w:szCs w:val="20"/>
+              </w:rPr>
+              <w:t xml:space="preserve">~Year 2 (18–24 months)</w:t>
+            </w:r>
+          </w:p>
+        </w:tc>
+        <w:tc>
+          <w:tcPr>
+            <w:tcW w:type="dxa" w:w="3166"/>
+          </w:tcPr>
+          <w:p>
+            <w:r>
+              <w:rPr>
+                <w:sz w:val="20"/>
+                <w:szCs w:val="20"/>
+              </w:rPr>
+              <w:t xml:space="preserve">Income scaling to R$4,500–8,000/month; ≈R$2,000–3,000/month saved.</w:t>
+            </w:r>
+          </w:p>
+        </w:tc>
+      </w:tr>
+      <w:tr>
+        <w:tc>
+          <w:tcPr>
+            <w:tcW w:type="dxa" w:w="3167"/>
+          </w:tcPr>
+          <w:p>
+            <w:r>
+              <w:rPr>
+                <w:sz w:val="20"/>
+                <w:szCs w:val="20"/>
+              </w:rPr>
+              <w:t xml:space="preserve">R$100,000</w:t>
+            </w:r>
+          </w:p>
+        </w:tc>
+        <w:tc>
+          <w:tcPr>
+            <w:tcW w:type="dxa" w:w="3167"/>
+          </w:tcPr>
+          <w:p>
+            <w:r>
+              <w:rPr>
+                <w:sz w:val="20"/>
+                <w:szCs w:val="20"/>
+              </w:rPr>
+              <w:t xml:space="preserve">~Year 3</w:t>
+            </w:r>
+          </w:p>
+        </w:tc>
+        <w:tc>
+          <w:tcPr>
+            <w:tcW w:type="dxa" w:w="3166"/>
+          </w:tcPr>
+          <w:p>
+            <w:r>
+              <w:rPr>
+                <w:sz w:val="20"/>
+                <w:szCs w:val="20"/>
+              </w:rPr>
+              <w:t xml:space="preserve">Matches this plan's own 3-year profit goal of “R$100,000+ net worth” (Phase 5).</w:t>
+            </w:r>
+          </w:p>
+        </w:tc>
+      </w:tr>
+      <w:tr>
+        <w:tc>
+          <w:tcPr>
+            <w:tcW w:type="dxa" w:w="3167"/>
+          </w:tcPr>
+          <w:p>
+            <w:r>
+              <w:rPr>
+                <w:sz w:val="20"/>
+                <w:szCs w:val="20"/>
+              </w:rPr>
+              <w:t xml:space="preserve">R$500,000</w:t>
+            </w:r>
+          </w:p>
+        </w:tc>
+        <w:tc>
+          <w:tcPr>
+            <w:tcW w:type="dxa" w:w="3167"/>
+          </w:tcPr>
+          <w:p>
+            <w:r>
+              <w:rPr>
+                <w:sz w:val="20"/>
+                <w:szCs w:val="20"/>
+              </w:rPr>
+              <w:t xml:space="preserve">~Year 7</w:t>
+            </w:r>
+          </w:p>
+        </w:tc>
+        <w:tc>
+          <w:tcPr>
+            <w:tcW w:type="dxa" w:w="3166"/>
+          </w:tcPr>
+          <w:p>
+            <w:r>
+              <w:rPr>
+                <w:sz w:val="20"/>
+                <w:szCs w:val="20"/>
+              </w:rPr>
+              <w:t xml:space="preserve">From the R$100k base: ≈R$7,000/month invested at ≈9%/year nominal return.</w:t>
+            </w:r>
+          </w:p>
+        </w:tc>
+      </w:tr>
+      <w:tr>
+        <w:tc>
+          <w:tcPr>
+            <w:tcW w:type="dxa" w:w="3167"/>
+          </w:tcPr>
+          <w:p>
+            <w:r>
+              <w:rPr>
+                <w:sz w:val="20"/>
+                <w:szCs w:val="20"/>
+              </w:rPr>
+              <w:t xml:space="preserve">R$1,000,000</w:t>
+            </w:r>
+          </w:p>
+        </w:tc>
+        <w:tc>
+          <w:tcPr>
+            <w:tcW w:type="dxa" w:w="3167"/>
+          </w:tcPr>
+          <w:p>
+            <w:r>
+              <w:rPr>
+                <w:sz w:val="20"/>
+                <w:szCs w:val="20"/>
+              </w:rPr>
+              <w:t xml:space="preserve">~Year 10</w:t>
+            </w:r>
+          </w:p>
+        </w:tc>
+        <w:tc>
+          <w:tcPr>
+            <w:tcW w:type="dxa" w:w="3166"/>
+          </w:tcPr>
+          <w:p>
+            <w:r>
+              <w:rPr>
+                <w:sz w:val="20"/>
+                <w:szCs w:val="20"/>
+              </w:rPr>
+              <w:t xml:space="preserve">Same ≈R$7,000/month contribution and ≈9%/year return assumption, continued.</w:t>
+            </w:r>
+          </w:p>
+        </w:tc>
+      </w:tr>
+    </w:tbl>
+    <w:p>
+      <w:pPr>
+        <w:spacing w:after="140"/>
+      </w:pPr>
+      <w:r>
+        <w:t xml:space="preserve">These are planning inputs, not promises: neither the contribution amount nor the return rate is guaranteed, and both compound in either direction. Recalculate this table with your real monthly savings rate once you have 2–3 months of actual numbers, and revisit it every 90 days along with the rest of the plan.</w:t>
       </w:r>
     </w:p>
     <w:p>

</xml_diff>